<commit_message>
Update meeting minutes (09-17-26)
Replace the Meeting Minutes/09-17-26.docx with an updated binary document. A temporary Office lock file (Meeting Minutes/~$-17-26.docx) was also added; consider adding Office temp files (~$*) to .gitignore to prevent accidental commits.
</commit_message>
<xml_diff>
--- a/Meeting Minutes/09-17-26.docx
+++ b/Meeting Minutes/09-17-26.docx
@@ -1,6 +1,6 @@
 
 <file path=word/document.xml><?xml version="1.0" encoding="utf-8"?>
-<w:document xmlns:wpc="http://schemas.microsoft.com/office/word/2010/wordprocessingCanvas" xmlns:cx="http://schemas.microsoft.com/office/drawing/2014/chartex" xmlns:cx1="http://schemas.microsoft.com/office/drawing/2015/9/8/chartex" xmlns:cx2="http://schemas.microsoft.com/office/drawing/2015/10/21/chartex" xmlns:cx3="http://schemas.microsoft.com/office/drawing/2016/5/9/chartex" xmlns:cx4="http://schemas.microsoft.com/office/drawing/2016/5/10/chartex" xmlns:cx5="http://schemas.microsoft.com/office/drawing/2016/5/11/chartex" xmlns:cx6="http://schemas.microsoft.com/office/drawing/2016/5/12/chartex" xmlns:cx7="http://schemas.microsoft.com/office/drawing/2016/5/13/chartex" xmlns:cx8="http://schemas.microsoft.com/office/drawing/2016/5/14/chartex" xmlns:mc="http://schemas.openxmlformats.org/markup-compatibility/2006" xmlns:aink="http://schemas.microsoft.com/office/drawing/2016/ink" xmlns:am3d="http://schemas.microsoft.com/office/drawing/2017/model3d" xmlns:o="urn:schemas-microsoft-com:office:office" xmlns:r="http://schemas.openxmlformats.org/officeDocument/2006/relationships" xmlns:m="http://schemas.openxmlformats.org/officeDocument/2006/math" xmlns:v="urn:schemas-microsoft-com:vml" xmlns:wp14="http://schemas.microsoft.com/office/word/2010/wordprocessingDrawing" xmlns:wp="http://schemas.openxmlformats.org/drawingml/2006/wordprocessingDrawing" xmlns:w10="urn:schemas-microsoft-com:office:word" xmlns:w="http://schemas.openxmlformats.org/wordprocessingml/2006/main" xmlns:w14="http://schemas.microsoft.com/office/word/2010/wordml" xmlns:w15="http://schemas.microsoft.com/office/word/2012/wordml" xmlns:w16cex="http://schemas.microsoft.com/office/word/2018/wordml/cex" xmlns:w16cid="http://schemas.microsoft.com/office/word/2016/wordml/cid" xmlns:w16="http://schemas.microsoft.com/office/word/2018/wordml" xmlns:w16sdtdh="http://schemas.microsoft.com/office/word/2020/wordml/sdtdatahash" xmlns:w16se="http://schemas.microsoft.com/office/word/2015/wordml/symex" xmlns:wpg="http://schemas.microsoft.com/office/word/2010/wordprocessingGroup" xmlns:wpi="http://schemas.microsoft.com/office/word/2010/wordprocessingInk" xmlns:wne="http://schemas.microsoft.com/office/word/2006/wordml" xmlns:wps="http://schemas.microsoft.com/office/word/2010/wordprocessingShape" mc:Ignorable="w14 w15 w16se w16cid w16 w16cex w16sdtdh wp14">
+<w:document xmlns:wpc="http://schemas.microsoft.com/office/word/2010/wordprocessingCanvas" xmlns:cx="http://schemas.microsoft.com/office/drawing/2014/chartex" xmlns:cx1="http://schemas.microsoft.com/office/drawing/2015/9/8/chartex" xmlns:cx2="http://schemas.microsoft.com/office/drawing/2015/10/21/chartex" xmlns:cx3="http://schemas.microsoft.com/office/drawing/2016/5/9/chartex" xmlns:cx4="http://schemas.microsoft.com/office/drawing/2016/5/10/chartex" xmlns:cx5="http://schemas.microsoft.com/office/drawing/2016/5/11/chartex" xmlns:cx6="http://schemas.microsoft.com/office/drawing/2016/5/12/chartex" xmlns:cx7="http://schemas.microsoft.com/office/drawing/2016/5/13/chartex" xmlns:cx8="http://schemas.microsoft.com/office/drawing/2016/5/14/chartex" xmlns:mc="http://schemas.openxmlformats.org/markup-compatibility/2006" xmlns:m="http://schemas.openxmlformats.org/officeDocument/2006/math" xmlns:aink="http://schemas.microsoft.com/office/drawing/2016/ink" xmlns:am3d="http://schemas.microsoft.com/office/drawing/2017/model3d" xmlns:oel="http://schemas.microsoft.com/office/2019/extlst" xmlns:r="http://schemas.openxmlformats.org/officeDocument/2006/relationships" xmlns:wp14="http://schemas.microsoft.com/office/word/2010/wordprocessingDrawing" xmlns:wp="http://schemas.openxmlformats.org/drawingml/2006/wordprocessingDrawing" xmlns:wpg="http://schemas.microsoft.com/office/word/2010/wordprocessingGroup" xmlns:wpi="http://schemas.microsoft.com/office/word/2010/wordprocessingInk" xmlns:wps="http://schemas.microsoft.com/office/word/2010/wordprocessingShape" xmlns:o="urn:schemas-microsoft-com:office:office" xmlns:v="urn:schemas-microsoft-com:vml" xmlns:w10="urn:schemas-microsoft-com:office:word" xmlns:w="http://schemas.openxmlformats.org/wordprocessingml/2006/main" xmlns:w14="http://schemas.microsoft.com/office/word/2010/wordml" xmlns:w15="http://schemas.microsoft.com/office/word/2012/wordml" xmlns:w16cex="http://schemas.microsoft.com/office/word/2018/wordml/cex" xmlns:w16cid="http://schemas.microsoft.com/office/word/2016/wordml/cid" xmlns:w16="http://schemas.microsoft.com/office/word/2018/wordml" xmlns:w16sdtdh="http://schemas.microsoft.com/office/word/2020/wordml/sdtdatahash" xmlns:w16sdtfl="http://schemas.microsoft.com/office/word/2024/wordml/sdtformatlock" xmlns:w16se="http://schemas.microsoft.com/office/word/2015/wordml/symex" xmlns:w16du="http://schemas.microsoft.com/office/word/2023/wordml/word16du" xmlns:wne="http://schemas.microsoft.com/office/word/2006/wordml" mc:Ignorable="w14 w15 w16se w16cid w16 w16cex w16sdtdh w16sdtfl w16du wp14">
   <w:body>
     <w:tbl>
       <w:tblPr>
@@ -92,6 +92,13 @@
               </w:rPr>
               <w:t xml:space="preserve">Team Name: </w:t>
             </w:r>
+            <w:r>
+              <w:rPr>
+                <w:rFonts w:asciiTheme="minorHAnsi" w:hAnsiTheme="minorHAnsi" w:cstheme="minorHAnsi"/>
+                <w:szCs w:val="28"/>
+              </w:rPr>
+              <w:t>Aggie Baja Controls (ABC)</w:t>
+            </w:r>
           </w:p>
         </w:tc>
       </w:tr>
@@ -138,6 +145,14 @@
               </w:rPr>
               <w:t>:</w:t>
             </w:r>
+            <w:r>
+              <w:rPr>
+                <w:rFonts w:asciiTheme="minorHAnsi" w:hAnsiTheme="minorHAnsi" w:cstheme="minorHAnsi"/>
+                <w:b/>
+                <w:szCs w:val="24"/>
+              </w:rPr>
+              <w:t xml:space="preserve"> 09-17-2026</w:t>
+            </w:r>
           </w:p>
         </w:tc>
         <w:tc>
@@ -164,6 +179,13 @@
                 <w:szCs w:val="24"/>
               </w:rPr>
               <w:t>Date of Last Sponsor Communication:</w:t>
+            </w:r>
+            <w:r>
+              <w:rPr>
+                <w:rFonts w:asciiTheme="minorHAnsi" w:hAnsiTheme="minorHAnsi" w:cstheme="minorHAnsi"/>
+                <w:szCs w:val="24"/>
+              </w:rPr>
+              <w:t xml:space="preserve"> 09-16-2026</w:t>
             </w:r>
           </w:p>
         </w:tc>
@@ -793,7 +815,7 @@
 </file>
 
 <file path=word/numbering.xml><?xml version="1.0" encoding="utf-8"?>
-<w:numbering xmlns:wpc="http://schemas.microsoft.com/office/word/2010/wordprocessingCanvas" xmlns:cx="http://schemas.microsoft.com/office/drawing/2014/chartex" xmlns:cx1="http://schemas.microsoft.com/office/drawing/2015/9/8/chartex" xmlns:cx2="http://schemas.microsoft.com/office/drawing/2015/10/21/chartex" xmlns:cx3="http://schemas.microsoft.com/office/drawing/2016/5/9/chartex" xmlns:cx4="http://schemas.microsoft.com/office/drawing/2016/5/10/chartex" xmlns:cx5="http://schemas.microsoft.com/office/drawing/2016/5/11/chartex" xmlns:cx6="http://schemas.microsoft.com/office/drawing/2016/5/12/chartex" xmlns:cx7="http://schemas.microsoft.com/office/drawing/2016/5/13/chartex" xmlns:cx8="http://schemas.microsoft.com/office/drawing/2016/5/14/chartex" xmlns:mc="http://schemas.openxmlformats.org/markup-compatibility/2006" xmlns:aink="http://schemas.microsoft.com/office/drawing/2016/ink" xmlns:am3d="http://schemas.microsoft.com/office/drawing/2017/model3d" xmlns:o="urn:schemas-microsoft-com:office:office" xmlns:r="http://schemas.openxmlformats.org/officeDocument/2006/relationships" xmlns:m="http://schemas.openxmlformats.org/officeDocument/2006/math" xmlns:v="urn:schemas-microsoft-com:vml" xmlns:wp14="http://schemas.microsoft.com/office/word/2010/wordprocessingDrawing" xmlns:wp="http://schemas.openxmlformats.org/drawingml/2006/wordprocessingDrawing" xmlns:w10="urn:schemas-microsoft-com:office:word" xmlns:w="http://schemas.openxmlformats.org/wordprocessingml/2006/main" xmlns:w14="http://schemas.microsoft.com/office/word/2010/wordml" xmlns:w15="http://schemas.microsoft.com/office/word/2012/wordml" xmlns:w16cex="http://schemas.microsoft.com/office/word/2018/wordml/cex" xmlns:w16cid="http://schemas.microsoft.com/office/word/2016/wordml/cid" xmlns:w16="http://schemas.microsoft.com/office/word/2018/wordml" xmlns:w16sdtdh="http://schemas.microsoft.com/office/word/2020/wordml/sdtdatahash" xmlns:w16se="http://schemas.microsoft.com/office/word/2015/wordml/symex" xmlns:wpg="http://schemas.microsoft.com/office/word/2010/wordprocessingGroup" xmlns:wpi="http://schemas.microsoft.com/office/word/2010/wordprocessingInk" xmlns:wne="http://schemas.microsoft.com/office/word/2006/wordml" xmlns:wps="http://schemas.microsoft.com/office/word/2010/wordprocessingShape" mc:Ignorable="w14 w15 w16se w16cid w16 w16cex w16sdtdh wp14">
+<w:numbering xmlns:wpc="http://schemas.microsoft.com/office/word/2010/wordprocessingCanvas" xmlns:cx="http://schemas.microsoft.com/office/drawing/2014/chartex" xmlns:cx1="http://schemas.microsoft.com/office/drawing/2015/9/8/chartex" xmlns:cx2="http://schemas.microsoft.com/office/drawing/2015/10/21/chartex" xmlns:cx3="http://schemas.microsoft.com/office/drawing/2016/5/9/chartex" xmlns:cx4="http://schemas.microsoft.com/office/drawing/2016/5/10/chartex" xmlns:cx5="http://schemas.microsoft.com/office/drawing/2016/5/11/chartex" xmlns:cx6="http://schemas.microsoft.com/office/drawing/2016/5/12/chartex" xmlns:cx7="http://schemas.microsoft.com/office/drawing/2016/5/13/chartex" xmlns:cx8="http://schemas.microsoft.com/office/drawing/2016/5/14/chartex" xmlns:mc="http://schemas.openxmlformats.org/markup-compatibility/2006" xmlns:m="http://schemas.openxmlformats.org/officeDocument/2006/math" xmlns:aink="http://schemas.microsoft.com/office/drawing/2016/ink" xmlns:am3d="http://schemas.microsoft.com/office/drawing/2017/model3d" xmlns:oel="http://schemas.microsoft.com/office/2019/extlst" xmlns:r="http://schemas.openxmlformats.org/officeDocument/2006/relationships" xmlns:wp14="http://schemas.microsoft.com/office/word/2010/wordprocessingDrawing" xmlns:wp="http://schemas.openxmlformats.org/drawingml/2006/wordprocessingDrawing" xmlns:wpg="http://schemas.microsoft.com/office/word/2010/wordprocessingGroup" xmlns:wpi="http://schemas.microsoft.com/office/word/2010/wordprocessingInk" xmlns:wps="http://schemas.microsoft.com/office/word/2010/wordprocessingShape" xmlns:o="urn:schemas-microsoft-com:office:office" xmlns:v="urn:schemas-microsoft-com:vml" xmlns:w10="urn:schemas-microsoft-com:office:word" xmlns:w="http://schemas.openxmlformats.org/wordprocessingml/2006/main" xmlns:w14="http://schemas.microsoft.com/office/word/2010/wordml" xmlns:w15="http://schemas.microsoft.com/office/word/2012/wordml" xmlns:w16cex="http://schemas.microsoft.com/office/word/2018/wordml/cex" xmlns:w16cid="http://schemas.microsoft.com/office/word/2016/wordml/cid" xmlns:w16="http://schemas.microsoft.com/office/word/2018/wordml" xmlns:w16sdtdh="http://schemas.microsoft.com/office/word/2020/wordml/sdtdatahash" xmlns:w16sdtfl="http://schemas.microsoft.com/office/word/2024/wordml/sdtformatlock" xmlns:w16se="http://schemas.microsoft.com/office/word/2015/wordml/symex" xmlns:w16du="http://schemas.microsoft.com/office/word/2023/wordml/word16du" xmlns:wne="http://schemas.microsoft.com/office/word/2006/wordml" mc:Ignorable="w14 w15 w16se w16cid w16 w16cex w16sdtdh w16sdtfl w16du wp14">
   <w:abstractNum w:abstractNumId="0" w15:restartNumberingAfterBreak="0">
     <w:nsid w:val="0CF11A53"/>
     <w:multiLevelType w:val="hybridMultilevel"/>
@@ -1422,26 +1444,26 @@
       </w:pPr>
     </w:lvl>
   </w:abstractNum>
-  <w:num w:numId="1">
+  <w:num w:numId="1" w16cid:durableId="2063365444">
     <w:abstractNumId w:val="2"/>
   </w:num>
-  <w:num w:numId="2">
+  <w:num w:numId="2" w16cid:durableId="1518811137">
     <w:abstractNumId w:val="3"/>
   </w:num>
-  <w:num w:numId="3">
+  <w:num w:numId="3" w16cid:durableId="144392358">
     <w:abstractNumId w:val="4"/>
   </w:num>
-  <w:num w:numId="4">
+  <w:num w:numId="4" w16cid:durableId="499663649">
     <w:abstractNumId w:val="1"/>
   </w:num>
-  <w:num w:numId="5">
+  <w:num w:numId="5" w16cid:durableId="706372192">
     <w:abstractNumId w:val="0"/>
   </w:num>
 </w:numbering>
 </file>
 
 <file path=word/styles.xml><?xml version="1.0" encoding="utf-8"?>
-<w:styles xmlns:mc="http://schemas.openxmlformats.org/markup-compatibility/2006" xmlns:r="http://schemas.openxmlformats.org/officeDocument/2006/relationships" xmlns:w="http://schemas.openxmlformats.org/wordprocessingml/2006/main" xmlns:w14="http://schemas.microsoft.com/office/word/2010/wordml" xmlns:w15="http://schemas.microsoft.com/office/word/2012/wordml" xmlns:w16cex="http://schemas.microsoft.com/office/word/2018/wordml/cex" xmlns:w16cid="http://schemas.microsoft.com/office/word/2016/wordml/cid" xmlns:w16="http://schemas.microsoft.com/office/word/2018/wordml" xmlns:w16sdtdh="http://schemas.microsoft.com/office/word/2020/wordml/sdtdatahash" xmlns:w16se="http://schemas.microsoft.com/office/word/2015/wordml/symex" mc:Ignorable="w14 w15 w16se w16cid w16 w16cex w16sdtdh">
+<w:styles xmlns:mc="http://schemas.openxmlformats.org/markup-compatibility/2006" xmlns:r="http://schemas.openxmlformats.org/officeDocument/2006/relationships" xmlns:w="http://schemas.openxmlformats.org/wordprocessingml/2006/main" xmlns:w14="http://schemas.microsoft.com/office/word/2010/wordml" xmlns:w15="http://schemas.microsoft.com/office/word/2012/wordml" xmlns:w16cex="http://schemas.microsoft.com/office/word/2018/wordml/cex" xmlns:w16cid="http://schemas.microsoft.com/office/word/2016/wordml/cid" xmlns:w16="http://schemas.microsoft.com/office/word/2018/wordml" xmlns:w16sdtdh="http://schemas.microsoft.com/office/word/2020/wordml/sdtdatahash" xmlns:w16sdtfl="http://schemas.microsoft.com/office/word/2024/wordml/sdtformatlock" xmlns:w16se="http://schemas.microsoft.com/office/word/2015/wordml/symex" xmlns:w16du="http://schemas.microsoft.com/office/word/2023/wordml/word16du" mc:Ignorable="w14 w15 w16se w16cid w16 w16cex w16sdtdh w16sdtfl w16du">
   <w:docDefaults>
     <w:rPrDefault>
       <w:rPr>
@@ -1550,6 +1572,7 @@
     <w:lsdException w:name="HTML Sample" w:semiHidden="1" w:unhideWhenUsed="1"/>
     <w:lsdException w:name="HTML Typewriter" w:semiHidden="1" w:unhideWhenUsed="1"/>
     <w:lsdException w:name="HTML Variable" w:semiHidden="1" w:unhideWhenUsed="1"/>
+    <w:lsdException w:name="Normal Table" w:semiHidden="1" w:unhideWhenUsed="1"/>
     <w:lsdException w:name="annotation subject" w:semiHidden="1" w:unhideWhenUsed="1"/>
     <w:lsdException w:name="No List" w:semiHidden="1" w:unhideWhenUsed="1"/>
     <w:lsdException w:name="Outline List 1" w:semiHidden="1" w:unhideWhenUsed="1"/>
@@ -1596,7 +1619,9 @@
     <w:lsdException w:name="Table Subtle 2" w:semiHidden="1" w:unhideWhenUsed="1"/>
     <w:lsdException w:name="Table Web 1" w:semiHidden="1" w:unhideWhenUsed="1"/>
     <w:lsdException w:name="Table Web 2" w:semiHidden="1" w:unhideWhenUsed="1"/>
+    <w:lsdException w:name="Table Web 3" w:semiHidden="1" w:unhideWhenUsed="1"/>
     <w:lsdException w:name="Balloon Text" w:semiHidden="1" w:unhideWhenUsed="1"/>
+    <w:lsdException w:name="Table Theme" w:semiHidden="1" w:unhideWhenUsed="1"/>
     <w:lsdException w:name="Placeholder Text" w:semiHidden="1" w:uiPriority="99"/>
     <w:lsdException w:name="No Spacing" w:uiPriority="1" w:qFormat="1"/>
     <w:lsdException w:name="Light Shading" w:uiPriority="60"/>

</xml_diff>

<commit_message>
Add team identity docs and logo
Update meeting minutes document, remove temporary autosave file, and add Team Identity and Contract Outline.docx along with aggie-baja-controls-logo.png to introduce branding and the team contract outline.
</commit_message>
<xml_diff>
--- a/Meeting Minutes/09-17-26.docx
+++ b/Meeting Minutes/09-17-26.docx
@@ -232,6 +232,12 @@
                 <w:rFonts w:asciiTheme="minorHAnsi" w:hAnsiTheme="minorHAnsi" w:cstheme="minorHAnsi"/>
               </w:rPr>
             </w:pPr>
+            <w:r>
+              <w:rPr>
+                <w:rFonts w:asciiTheme="minorHAnsi" w:hAnsiTheme="minorHAnsi" w:cstheme="minorHAnsi"/>
+              </w:rPr>
+              <w:t>Introductions</w:t>
+            </w:r>
           </w:p>
           <w:p>
             <w:pPr>
@@ -247,6 +253,12 @@
                 <w:rFonts w:asciiTheme="minorHAnsi" w:hAnsiTheme="minorHAnsi" w:cstheme="minorHAnsi"/>
               </w:rPr>
             </w:pPr>
+            <w:r>
+              <w:rPr>
+                <w:rFonts w:asciiTheme="minorHAnsi" w:hAnsiTheme="minorHAnsi" w:cstheme="minorHAnsi"/>
+              </w:rPr>
+              <w:t>Watch Meeting Minutes Video</w:t>
+            </w:r>
           </w:p>
           <w:p>
             <w:pPr>
@@ -262,6 +274,12 @@
                 <w:rFonts w:asciiTheme="minorHAnsi" w:hAnsiTheme="minorHAnsi" w:cstheme="minorHAnsi"/>
               </w:rPr>
             </w:pPr>
+            <w:r>
+              <w:rPr>
+                <w:rFonts w:asciiTheme="minorHAnsi" w:hAnsiTheme="minorHAnsi" w:cstheme="minorHAnsi"/>
+              </w:rPr>
+              <w:t>GitHub setup</w:t>
+            </w:r>
           </w:p>
           <w:p>
             <w:pPr>
@@ -277,6 +295,12 @@
                 <w:rFonts w:asciiTheme="minorHAnsi" w:hAnsiTheme="minorHAnsi" w:cstheme="minorHAnsi"/>
               </w:rPr>
             </w:pPr>
+            <w:r>
+              <w:rPr>
+                <w:rFonts w:asciiTheme="minorHAnsi" w:hAnsiTheme="minorHAnsi" w:cstheme="minorHAnsi"/>
+              </w:rPr>
+              <w:t>Contract Work through</w:t>
+            </w:r>
           </w:p>
           <w:p>
             <w:pPr>
@@ -292,6 +316,12 @@
                 <w:rFonts w:asciiTheme="minorHAnsi" w:hAnsiTheme="minorHAnsi" w:cstheme="minorHAnsi"/>
               </w:rPr>
             </w:pPr>
+            <w:r>
+              <w:rPr>
+                <w:rFonts w:asciiTheme="minorHAnsi" w:hAnsiTheme="minorHAnsi" w:cstheme="minorHAnsi"/>
+              </w:rPr>
+              <w:t>Finish out the Minute file (This file)</w:t>
+            </w:r>
           </w:p>
           <w:p>
             <w:pPr>
@@ -340,31 +370,57 @@
           </w:p>
           <w:p>
             <w:pPr>
-              <w:rPr>
-                <w:rFonts w:asciiTheme="minorHAnsi" w:hAnsiTheme="minorHAnsi" w:cstheme="minorHAnsi"/>
-              </w:rPr>
-            </w:pPr>
-          </w:p>
-          <w:p>
-            <w:pPr>
-              <w:rPr>
-                <w:rFonts w:asciiTheme="minorHAnsi" w:hAnsiTheme="minorHAnsi" w:cstheme="minorHAnsi"/>
-              </w:rPr>
-            </w:pPr>
-          </w:p>
-          <w:p>
-            <w:pPr>
-              <w:rPr>
-                <w:rFonts w:asciiTheme="minorHAnsi" w:hAnsiTheme="minorHAnsi" w:cstheme="minorHAnsi"/>
-              </w:rPr>
-            </w:pPr>
-          </w:p>
-          <w:p>
-            <w:pPr>
-              <w:rPr>
-                <w:rFonts w:asciiTheme="minorHAnsi" w:hAnsiTheme="minorHAnsi" w:cstheme="minorHAnsi"/>
-              </w:rPr>
-            </w:pPr>
+              <w:pStyle w:val="ListParagraph"/>
+              <w:numPr>
+                <w:ilvl w:val="0"/>
+                <w:numId w:val="6"/>
+              </w:numPr>
+              <w:rPr>
+                <w:rFonts w:asciiTheme="minorHAnsi" w:hAnsiTheme="minorHAnsi" w:cstheme="minorHAnsi"/>
+              </w:rPr>
+            </w:pPr>
+            <w:r>
+              <w:rPr>
+                <w:rFonts w:asciiTheme="minorHAnsi" w:hAnsiTheme="minorHAnsi" w:cstheme="minorHAnsi"/>
+              </w:rPr>
+              <w:t>Team Identity and Contract</w:t>
+            </w:r>
+          </w:p>
+          <w:p>
+            <w:pPr>
+              <w:pStyle w:val="ListParagraph"/>
+              <w:numPr>
+                <w:ilvl w:val="0"/>
+                <w:numId w:val="6"/>
+              </w:numPr>
+              <w:rPr>
+                <w:rFonts w:asciiTheme="minorHAnsi" w:hAnsiTheme="minorHAnsi" w:cstheme="minorHAnsi"/>
+              </w:rPr>
+            </w:pPr>
+            <w:r>
+              <w:rPr>
+                <w:rFonts w:asciiTheme="minorHAnsi" w:hAnsiTheme="minorHAnsi" w:cstheme="minorHAnsi"/>
+              </w:rPr>
+              <w:t>Baja General Structure and needed information</w:t>
+            </w:r>
+          </w:p>
+          <w:p>
+            <w:pPr>
+              <w:pStyle w:val="ListParagraph"/>
+              <w:numPr>
+                <w:ilvl w:val="0"/>
+                <w:numId w:val="6"/>
+              </w:numPr>
+              <w:rPr>
+                <w:rFonts w:asciiTheme="minorHAnsi" w:hAnsiTheme="minorHAnsi" w:cstheme="minorHAnsi"/>
+              </w:rPr>
+            </w:pPr>
+            <w:r>
+              <w:rPr>
+                <w:rFonts w:asciiTheme="minorHAnsi" w:hAnsiTheme="minorHAnsi" w:cstheme="minorHAnsi"/>
+              </w:rPr>
+              <w:t>Who is who (Get to know you)</w:t>
+            </w:r>
           </w:p>
           <w:p>
             <w:pPr>
@@ -410,38 +466,57 @@
           </w:p>
           <w:p>
             <w:pPr>
-              <w:rPr>
-                <w:rFonts w:asciiTheme="minorHAnsi" w:hAnsiTheme="minorHAnsi" w:cstheme="minorHAnsi"/>
-              </w:rPr>
-            </w:pPr>
-          </w:p>
-          <w:p>
-            <w:pPr>
-              <w:rPr>
-                <w:rFonts w:asciiTheme="minorHAnsi" w:hAnsiTheme="minorHAnsi" w:cstheme="minorHAnsi"/>
-              </w:rPr>
-            </w:pPr>
-          </w:p>
-          <w:p>
-            <w:pPr>
-              <w:rPr>
-                <w:rFonts w:asciiTheme="minorHAnsi" w:hAnsiTheme="minorHAnsi" w:cstheme="minorHAnsi"/>
-              </w:rPr>
-            </w:pPr>
-          </w:p>
-          <w:p>
-            <w:pPr>
-              <w:rPr>
-                <w:rFonts w:asciiTheme="minorHAnsi" w:hAnsiTheme="minorHAnsi" w:cstheme="minorHAnsi"/>
-              </w:rPr>
-            </w:pPr>
-          </w:p>
-          <w:p>
-            <w:pPr>
-              <w:rPr>
-                <w:rFonts w:asciiTheme="minorHAnsi" w:hAnsiTheme="minorHAnsi" w:cstheme="minorHAnsi"/>
-              </w:rPr>
-            </w:pPr>
+              <w:pStyle w:val="ListParagraph"/>
+              <w:numPr>
+                <w:ilvl w:val="0"/>
+                <w:numId w:val="7"/>
+              </w:numPr>
+              <w:rPr>
+                <w:rFonts w:asciiTheme="minorHAnsi" w:hAnsiTheme="minorHAnsi" w:cstheme="minorHAnsi"/>
+              </w:rPr>
+            </w:pPr>
+            <w:r>
+              <w:rPr>
+                <w:rFonts w:asciiTheme="minorHAnsi" w:hAnsiTheme="minorHAnsi" w:cstheme="minorHAnsi"/>
+              </w:rPr>
+              <w:t>Each item in the Identity and Contract</w:t>
+            </w:r>
+          </w:p>
+          <w:p>
+            <w:pPr>
+              <w:pStyle w:val="ListParagraph"/>
+              <w:numPr>
+                <w:ilvl w:val="0"/>
+                <w:numId w:val="7"/>
+              </w:numPr>
+              <w:rPr>
+                <w:rFonts w:asciiTheme="minorHAnsi" w:hAnsiTheme="minorHAnsi" w:cstheme="minorHAnsi"/>
+              </w:rPr>
+            </w:pPr>
+            <w:r>
+              <w:rPr>
+                <w:rFonts w:asciiTheme="minorHAnsi" w:hAnsiTheme="minorHAnsi" w:cstheme="minorHAnsi"/>
+              </w:rPr>
+              <w:t>Upcoming Action items</w:t>
+            </w:r>
+          </w:p>
+          <w:p>
+            <w:pPr>
+              <w:pStyle w:val="ListParagraph"/>
+              <w:numPr>
+                <w:ilvl w:val="0"/>
+                <w:numId w:val="7"/>
+              </w:numPr>
+              <w:rPr>
+                <w:rFonts w:asciiTheme="minorHAnsi" w:hAnsiTheme="minorHAnsi" w:cstheme="minorHAnsi"/>
+              </w:rPr>
+            </w:pPr>
+            <w:r>
+              <w:rPr>
+                <w:rFonts w:asciiTheme="minorHAnsi" w:hAnsiTheme="minorHAnsi" w:cstheme="minorHAnsi"/>
+              </w:rPr>
+              <w:t>Who will do what for the project as a whole.</w:t>
+            </w:r>
           </w:p>
         </w:tc>
       </w:tr>
@@ -560,6 +635,12 @@
                 <w:rFonts w:asciiTheme="minorHAnsi" w:hAnsiTheme="minorHAnsi" w:cstheme="minorHAnsi"/>
               </w:rPr>
             </w:pPr>
+            <w:r>
+              <w:rPr>
+                <w:rFonts w:asciiTheme="minorHAnsi" w:hAnsiTheme="minorHAnsi" w:cstheme="minorHAnsi"/>
+              </w:rPr>
+              <w:t>Learn GitHub</w:t>
+            </w:r>
           </w:p>
         </w:tc>
         <w:tc>
@@ -575,6 +656,12 @@
                 <w:rFonts w:asciiTheme="minorHAnsi" w:hAnsiTheme="minorHAnsi" w:cstheme="minorHAnsi"/>
               </w:rPr>
             </w:pPr>
+            <w:r>
+              <w:rPr>
+                <w:rFonts w:asciiTheme="minorHAnsi" w:hAnsiTheme="minorHAnsi" w:cstheme="minorHAnsi"/>
+              </w:rPr>
+              <w:t>Alex (Others learning)</w:t>
+            </w:r>
           </w:p>
         </w:tc>
         <w:tc>
@@ -591,6 +678,12 @@
                 <w:rFonts w:asciiTheme="minorHAnsi" w:hAnsiTheme="minorHAnsi" w:cstheme="minorHAnsi"/>
               </w:rPr>
             </w:pPr>
+            <w:r>
+              <w:rPr>
+                <w:rFonts w:asciiTheme="minorHAnsi" w:hAnsiTheme="minorHAnsi" w:cstheme="minorHAnsi"/>
+              </w:rPr>
+              <w:t>09/24/26</w:t>
+            </w:r>
           </w:p>
         </w:tc>
       </w:tr>
@@ -612,6 +705,12 @@
                 <w:rFonts w:asciiTheme="minorHAnsi" w:hAnsiTheme="minorHAnsi" w:cstheme="minorHAnsi"/>
               </w:rPr>
             </w:pPr>
+            <w:r>
+              <w:rPr>
+                <w:rFonts w:asciiTheme="minorHAnsi" w:hAnsiTheme="minorHAnsi" w:cstheme="minorHAnsi"/>
+              </w:rPr>
+              <w:t>Reach out to Dr. Graham</w:t>
+            </w:r>
           </w:p>
         </w:tc>
         <w:tc>
@@ -627,6 +726,12 @@
                 <w:rFonts w:asciiTheme="minorHAnsi" w:hAnsiTheme="minorHAnsi" w:cstheme="minorHAnsi"/>
               </w:rPr>
             </w:pPr>
+            <w:r>
+              <w:rPr>
+                <w:rFonts w:asciiTheme="minorHAnsi" w:hAnsiTheme="minorHAnsi" w:cstheme="minorHAnsi"/>
+              </w:rPr>
+              <w:t>Jacob</w:t>
+            </w:r>
           </w:p>
         </w:tc>
         <w:tc>
@@ -643,6 +748,12 @@
                 <w:rFonts w:asciiTheme="minorHAnsi" w:hAnsiTheme="minorHAnsi" w:cstheme="minorHAnsi"/>
               </w:rPr>
             </w:pPr>
+            <w:r>
+              <w:rPr>
+                <w:rFonts w:asciiTheme="minorHAnsi" w:hAnsiTheme="minorHAnsi" w:cstheme="minorHAnsi"/>
+              </w:rPr>
+              <w:t>09/24/26</w:t>
+            </w:r>
           </w:p>
         </w:tc>
       </w:tr>
@@ -664,6 +775,12 @@
                 <w:rFonts w:asciiTheme="minorHAnsi" w:hAnsiTheme="minorHAnsi" w:cstheme="minorHAnsi"/>
               </w:rPr>
             </w:pPr>
+            <w:r>
+              <w:rPr>
+                <w:rFonts w:asciiTheme="minorHAnsi" w:hAnsiTheme="minorHAnsi" w:cstheme="minorHAnsi"/>
+              </w:rPr>
+              <w:t>Read into Baja Code</w:t>
+            </w:r>
           </w:p>
         </w:tc>
         <w:tc>
@@ -679,6 +796,12 @@
                 <w:rFonts w:asciiTheme="minorHAnsi" w:hAnsiTheme="minorHAnsi" w:cstheme="minorHAnsi"/>
               </w:rPr>
             </w:pPr>
+            <w:r>
+              <w:rPr>
+                <w:rFonts w:asciiTheme="minorHAnsi" w:hAnsiTheme="minorHAnsi" w:cstheme="minorHAnsi"/>
+              </w:rPr>
+              <w:t>Ben</w:t>
+            </w:r>
           </w:p>
         </w:tc>
         <w:tc>
@@ -695,6 +818,12 @@
                 <w:rFonts w:asciiTheme="minorHAnsi" w:hAnsiTheme="minorHAnsi" w:cstheme="minorHAnsi"/>
               </w:rPr>
             </w:pPr>
+            <w:r>
+              <w:rPr>
+                <w:rFonts w:asciiTheme="minorHAnsi" w:hAnsiTheme="minorHAnsi" w:cstheme="minorHAnsi"/>
+              </w:rPr>
+              <w:t>10/1/26</w:t>
+            </w:r>
           </w:p>
         </w:tc>
       </w:tr>
@@ -817,6 +946,119 @@
 <file path=word/numbering.xml><?xml version="1.0" encoding="utf-8"?>
 <w:numbering xmlns:wpc="http://schemas.microsoft.com/office/word/2010/wordprocessingCanvas" xmlns:cx="http://schemas.microsoft.com/office/drawing/2014/chartex" xmlns:cx1="http://schemas.microsoft.com/office/drawing/2015/9/8/chartex" xmlns:cx2="http://schemas.microsoft.com/office/drawing/2015/10/21/chartex" xmlns:cx3="http://schemas.microsoft.com/office/drawing/2016/5/9/chartex" xmlns:cx4="http://schemas.microsoft.com/office/drawing/2016/5/10/chartex" xmlns:cx5="http://schemas.microsoft.com/office/drawing/2016/5/11/chartex" xmlns:cx6="http://schemas.microsoft.com/office/drawing/2016/5/12/chartex" xmlns:cx7="http://schemas.microsoft.com/office/drawing/2016/5/13/chartex" xmlns:cx8="http://schemas.microsoft.com/office/drawing/2016/5/14/chartex" xmlns:mc="http://schemas.openxmlformats.org/markup-compatibility/2006" xmlns:m="http://schemas.openxmlformats.org/officeDocument/2006/math" xmlns:aink="http://schemas.microsoft.com/office/drawing/2016/ink" xmlns:am3d="http://schemas.microsoft.com/office/drawing/2017/model3d" xmlns:oel="http://schemas.microsoft.com/office/2019/extlst" xmlns:r="http://schemas.openxmlformats.org/officeDocument/2006/relationships" xmlns:wp14="http://schemas.microsoft.com/office/word/2010/wordprocessingDrawing" xmlns:wp="http://schemas.openxmlformats.org/drawingml/2006/wordprocessingDrawing" xmlns:wpg="http://schemas.microsoft.com/office/word/2010/wordprocessingGroup" xmlns:wpi="http://schemas.microsoft.com/office/word/2010/wordprocessingInk" xmlns:wps="http://schemas.microsoft.com/office/word/2010/wordprocessingShape" xmlns:o="urn:schemas-microsoft-com:office:office" xmlns:v="urn:schemas-microsoft-com:vml" xmlns:w10="urn:schemas-microsoft-com:office:word" xmlns:w="http://schemas.openxmlformats.org/wordprocessingml/2006/main" xmlns:w14="http://schemas.microsoft.com/office/word/2010/wordml" xmlns:w15="http://schemas.microsoft.com/office/word/2012/wordml" xmlns:w16cex="http://schemas.microsoft.com/office/word/2018/wordml/cex" xmlns:w16cid="http://schemas.microsoft.com/office/word/2016/wordml/cid" xmlns:w16="http://schemas.microsoft.com/office/word/2018/wordml" xmlns:w16sdtdh="http://schemas.microsoft.com/office/word/2020/wordml/sdtdatahash" xmlns:w16sdtfl="http://schemas.microsoft.com/office/word/2024/wordml/sdtformatlock" xmlns:w16se="http://schemas.microsoft.com/office/word/2015/wordml/symex" xmlns:w16du="http://schemas.microsoft.com/office/word/2023/wordml/word16du" xmlns:wne="http://schemas.microsoft.com/office/word/2006/wordml" mc:Ignorable="w14 w15 w16se w16cid w16 w16cex w16sdtdh w16sdtfl w16du wp14">
   <w:abstractNum w:abstractNumId="0" w15:restartNumberingAfterBreak="0">
+    <w:nsid w:val="09E130C1"/>
+    <w:multiLevelType w:val="hybridMultilevel"/>
+    <w:tmpl w:val="45A89C90"/>
+    <w:lvl w:ilvl="0" w:tplc="04090001">
+      <w:start w:val="1"/>
+      <w:numFmt w:val="bullet"/>
+      <w:lvlText w:val=""/>
+      <w:lvlJc w:val="left"/>
+      <w:pPr>
+        <w:ind w:left="720" w:hanging="360"/>
+      </w:pPr>
+      <w:rPr>
+        <w:rFonts w:ascii="Symbol" w:hAnsi="Symbol" w:hint="default"/>
+      </w:rPr>
+    </w:lvl>
+    <w:lvl w:ilvl="1" w:tplc="04090003" w:tentative="1">
+      <w:start w:val="1"/>
+      <w:numFmt w:val="bullet"/>
+      <w:lvlText w:val="o"/>
+      <w:lvlJc w:val="left"/>
+      <w:pPr>
+        <w:ind w:left="1440" w:hanging="360"/>
+      </w:pPr>
+      <w:rPr>
+        <w:rFonts w:ascii="Courier New" w:hAnsi="Courier New" w:cs="Courier New" w:hint="default"/>
+      </w:rPr>
+    </w:lvl>
+    <w:lvl w:ilvl="2" w:tplc="04090005" w:tentative="1">
+      <w:start w:val="1"/>
+      <w:numFmt w:val="bullet"/>
+      <w:lvlText w:val=""/>
+      <w:lvlJc w:val="left"/>
+      <w:pPr>
+        <w:ind w:left="2160" w:hanging="360"/>
+      </w:pPr>
+      <w:rPr>
+        <w:rFonts w:ascii="Wingdings" w:hAnsi="Wingdings" w:hint="default"/>
+      </w:rPr>
+    </w:lvl>
+    <w:lvl w:ilvl="3" w:tplc="04090001" w:tentative="1">
+      <w:start w:val="1"/>
+      <w:numFmt w:val="bullet"/>
+      <w:lvlText w:val=""/>
+      <w:lvlJc w:val="left"/>
+      <w:pPr>
+        <w:ind w:left="2880" w:hanging="360"/>
+      </w:pPr>
+      <w:rPr>
+        <w:rFonts w:ascii="Symbol" w:hAnsi="Symbol" w:hint="default"/>
+      </w:rPr>
+    </w:lvl>
+    <w:lvl w:ilvl="4" w:tplc="04090003" w:tentative="1">
+      <w:start w:val="1"/>
+      <w:numFmt w:val="bullet"/>
+      <w:lvlText w:val="o"/>
+      <w:lvlJc w:val="left"/>
+      <w:pPr>
+        <w:ind w:left="3600" w:hanging="360"/>
+      </w:pPr>
+      <w:rPr>
+        <w:rFonts w:ascii="Courier New" w:hAnsi="Courier New" w:cs="Courier New" w:hint="default"/>
+      </w:rPr>
+    </w:lvl>
+    <w:lvl w:ilvl="5" w:tplc="04090005" w:tentative="1">
+      <w:start w:val="1"/>
+      <w:numFmt w:val="bullet"/>
+      <w:lvlText w:val=""/>
+      <w:lvlJc w:val="left"/>
+      <w:pPr>
+        <w:ind w:left="4320" w:hanging="360"/>
+      </w:pPr>
+      <w:rPr>
+        <w:rFonts w:ascii="Wingdings" w:hAnsi="Wingdings" w:hint="default"/>
+      </w:rPr>
+    </w:lvl>
+    <w:lvl w:ilvl="6" w:tplc="04090001" w:tentative="1">
+      <w:start w:val="1"/>
+      <w:numFmt w:val="bullet"/>
+      <w:lvlText w:val=""/>
+      <w:lvlJc w:val="left"/>
+      <w:pPr>
+        <w:ind w:left="5040" w:hanging="360"/>
+      </w:pPr>
+      <w:rPr>
+        <w:rFonts w:ascii="Symbol" w:hAnsi="Symbol" w:hint="default"/>
+      </w:rPr>
+    </w:lvl>
+    <w:lvl w:ilvl="7" w:tplc="04090003" w:tentative="1">
+      <w:start w:val="1"/>
+      <w:numFmt w:val="bullet"/>
+      <w:lvlText w:val="o"/>
+      <w:lvlJc w:val="left"/>
+      <w:pPr>
+        <w:ind w:left="5760" w:hanging="360"/>
+      </w:pPr>
+      <w:rPr>
+        <w:rFonts w:ascii="Courier New" w:hAnsi="Courier New" w:cs="Courier New" w:hint="default"/>
+      </w:rPr>
+    </w:lvl>
+    <w:lvl w:ilvl="8" w:tplc="04090005" w:tentative="1">
+      <w:start w:val="1"/>
+      <w:numFmt w:val="bullet"/>
+      <w:lvlText w:val=""/>
+      <w:lvlJc w:val="left"/>
+      <w:pPr>
+        <w:ind w:left="6480" w:hanging="360"/>
+      </w:pPr>
+      <w:rPr>
+        <w:rFonts w:ascii="Wingdings" w:hAnsi="Wingdings" w:hint="default"/>
+      </w:rPr>
+    </w:lvl>
+  </w:abstractNum>
+  <w:abstractNum w:abstractNumId="1" w15:restartNumberingAfterBreak="0">
     <w:nsid w:val="0CF11A53"/>
     <w:multiLevelType w:val="hybridMultilevel"/>
     <w:tmpl w:val="2E6A06FA"/>
@@ -929,7 +1171,120 @@
       </w:pPr>
     </w:lvl>
   </w:abstractNum>
-  <w:abstractNum w:abstractNumId="1" w15:restartNumberingAfterBreak="0">
+  <w:abstractNum w:abstractNumId="2" w15:restartNumberingAfterBreak="0">
+    <w:nsid w:val="166A217C"/>
+    <w:multiLevelType w:val="hybridMultilevel"/>
+    <w:tmpl w:val="94E45342"/>
+    <w:lvl w:ilvl="0" w:tplc="04090001">
+      <w:start w:val="1"/>
+      <w:numFmt w:val="bullet"/>
+      <w:lvlText w:val=""/>
+      <w:lvlJc w:val="left"/>
+      <w:pPr>
+        <w:ind w:left="720" w:hanging="360"/>
+      </w:pPr>
+      <w:rPr>
+        <w:rFonts w:ascii="Symbol" w:hAnsi="Symbol" w:hint="default"/>
+      </w:rPr>
+    </w:lvl>
+    <w:lvl w:ilvl="1" w:tplc="04090003" w:tentative="1">
+      <w:start w:val="1"/>
+      <w:numFmt w:val="bullet"/>
+      <w:lvlText w:val="o"/>
+      <w:lvlJc w:val="left"/>
+      <w:pPr>
+        <w:ind w:left="1440" w:hanging="360"/>
+      </w:pPr>
+      <w:rPr>
+        <w:rFonts w:ascii="Courier New" w:hAnsi="Courier New" w:cs="Courier New" w:hint="default"/>
+      </w:rPr>
+    </w:lvl>
+    <w:lvl w:ilvl="2" w:tplc="04090005" w:tentative="1">
+      <w:start w:val="1"/>
+      <w:numFmt w:val="bullet"/>
+      <w:lvlText w:val=""/>
+      <w:lvlJc w:val="left"/>
+      <w:pPr>
+        <w:ind w:left="2160" w:hanging="360"/>
+      </w:pPr>
+      <w:rPr>
+        <w:rFonts w:ascii="Wingdings" w:hAnsi="Wingdings" w:hint="default"/>
+      </w:rPr>
+    </w:lvl>
+    <w:lvl w:ilvl="3" w:tplc="04090001" w:tentative="1">
+      <w:start w:val="1"/>
+      <w:numFmt w:val="bullet"/>
+      <w:lvlText w:val=""/>
+      <w:lvlJc w:val="left"/>
+      <w:pPr>
+        <w:ind w:left="2880" w:hanging="360"/>
+      </w:pPr>
+      <w:rPr>
+        <w:rFonts w:ascii="Symbol" w:hAnsi="Symbol" w:hint="default"/>
+      </w:rPr>
+    </w:lvl>
+    <w:lvl w:ilvl="4" w:tplc="04090003" w:tentative="1">
+      <w:start w:val="1"/>
+      <w:numFmt w:val="bullet"/>
+      <w:lvlText w:val="o"/>
+      <w:lvlJc w:val="left"/>
+      <w:pPr>
+        <w:ind w:left="3600" w:hanging="360"/>
+      </w:pPr>
+      <w:rPr>
+        <w:rFonts w:ascii="Courier New" w:hAnsi="Courier New" w:cs="Courier New" w:hint="default"/>
+      </w:rPr>
+    </w:lvl>
+    <w:lvl w:ilvl="5" w:tplc="04090005" w:tentative="1">
+      <w:start w:val="1"/>
+      <w:numFmt w:val="bullet"/>
+      <w:lvlText w:val=""/>
+      <w:lvlJc w:val="left"/>
+      <w:pPr>
+        <w:ind w:left="4320" w:hanging="360"/>
+      </w:pPr>
+      <w:rPr>
+        <w:rFonts w:ascii="Wingdings" w:hAnsi="Wingdings" w:hint="default"/>
+      </w:rPr>
+    </w:lvl>
+    <w:lvl w:ilvl="6" w:tplc="04090001" w:tentative="1">
+      <w:start w:val="1"/>
+      <w:numFmt w:val="bullet"/>
+      <w:lvlText w:val=""/>
+      <w:lvlJc w:val="left"/>
+      <w:pPr>
+        <w:ind w:left="5040" w:hanging="360"/>
+      </w:pPr>
+      <w:rPr>
+        <w:rFonts w:ascii="Symbol" w:hAnsi="Symbol" w:hint="default"/>
+      </w:rPr>
+    </w:lvl>
+    <w:lvl w:ilvl="7" w:tplc="04090003" w:tentative="1">
+      <w:start w:val="1"/>
+      <w:numFmt w:val="bullet"/>
+      <w:lvlText w:val="o"/>
+      <w:lvlJc w:val="left"/>
+      <w:pPr>
+        <w:ind w:left="5760" w:hanging="360"/>
+      </w:pPr>
+      <w:rPr>
+        <w:rFonts w:ascii="Courier New" w:hAnsi="Courier New" w:cs="Courier New" w:hint="default"/>
+      </w:rPr>
+    </w:lvl>
+    <w:lvl w:ilvl="8" w:tplc="04090005" w:tentative="1">
+      <w:start w:val="1"/>
+      <w:numFmt w:val="bullet"/>
+      <w:lvlText w:val=""/>
+      <w:lvlJc w:val="left"/>
+      <w:pPr>
+        <w:ind w:left="6480" w:hanging="360"/>
+      </w:pPr>
+      <w:rPr>
+        <w:rFonts w:ascii="Wingdings" w:hAnsi="Wingdings" w:hint="default"/>
+      </w:rPr>
+    </w:lvl>
+  </w:abstractNum>
+  <w:abstractNum w:abstractNumId="3" w15:restartNumberingAfterBreak="0">
     <w:nsid w:val="21B43426"/>
     <w:multiLevelType w:val="hybridMultilevel"/>
     <w:tmpl w:val="8CD07B06"/>
@@ -1069,7 +1424,7 @@
       </w:rPr>
     </w:lvl>
   </w:abstractNum>
-  <w:abstractNum w:abstractNumId="2" w15:restartNumberingAfterBreak="0">
+  <w:abstractNum w:abstractNumId="4" w15:restartNumberingAfterBreak="0">
     <w:nsid w:val="334807A8"/>
     <w:multiLevelType w:val="multilevel"/>
     <w:tmpl w:val="BE30A754"/>
@@ -1218,7 +1573,7 @@
       </w:rPr>
     </w:lvl>
   </w:abstractNum>
-  <w:abstractNum w:abstractNumId="3" w15:restartNumberingAfterBreak="0">
+  <w:abstractNum w:abstractNumId="5" w15:restartNumberingAfterBreak="0">
     <w:nsid w:val="431F5019"/>
     <w:multiLevelType w:val="hybridMultilevel"/>
     <w:tmpl w:val="233AE490"/>
@@ -1331,7 +1686,7 @@
       </w:pPr>
     </w:lvl>
   </w:abstractNum>
-  <w:abstractNum w:abstractNumId="4" w15:restartNumberingAfterBreak="0">
+  <w:abstractNum w:abstractNumId="6" w15:restartNumberingAfterBreak="0">
     <w:nsid w:val="5A1109CB"/>
     <w:multiLevelType w:val="hybridMultilevel"/>
     <w:tmpl w:val="A29A75C8"/>
@@ -1445,18 +1800,24 @@
     </w:lvl>
   </w:abstractNum>
   <w:num w:numId="1" w16cid:durableId="2063365444">
+    <w:abstractNumId w:val="4"/>
+  </w:num>
+  <w:num w:numId="2" w16cid:durableId="1518811137">
+    <w:abstractNumId w:val="5"/>
+  </w:num>
+  <w:num w:numId="3" w16cid:durableId="144392358">
+    <w:abstractNumId w:val="6"/>
+  </w:num>
+  <w:num w:numId="4" w16cid:durableId="499663649">
+    <w:abstractNumId w:val="3"/>
+  </w:num>
+  <w:num w:numId="5" w16cid:durableId="706372192">
+    <w:abstractNumId w:val="1"/>
+  </w:num>
+  <w:num w:numId="6" w16cid:durableId="97915281">
     <w:abstractNumId w:val="2"/>
   </w:num>
-  <w:num w:numId="2" w16cid:durableId="1518811137">
-    <w:abstractNumId w:val="3"/>
-  </w:num>
-  <w:num w:numId="3" w16cid:durableId="144392358">
-    <w:abstractNumId w:val="4"/>
-  </w:num>
-  <w:num w:numId="4" w16cid:durableId="499663649">
-    <w:abstractNumId w:val="1"/>
-  </w:num>
-  <w:num w:numId="5" w16cid:durableId="706372192">
+  <w:num w:numId="7" w16cid:durableId="2079130386">
     <w:abstractNumId w:val="0"/>
   </w:num>
 </w:numbering>
@@ -1960,6 +2321,17 @@
       <w:bCs/>
     </w:rPr>
   </w:style>
+  <w:style w:type="paragraph" w:styleId="ListParagraph">
+    <w:name w:val="List Paragraph"/>
+    <w:basedOn w:val="Normal"/>
+    <w:uiPriority w:val="34"/>
+    <w:qFormat/>
+    <w:rsid w:val="00CB0088"/>
+    <w:pPr>
+      <w:ind w:left="720"/>
+      <w:contextualSpacing/>
+    </w:pPr>
+  </w:style>
 </w:styles>
 </file>
 

</xml_diff>